<commit_message>
fix(ncr): update N26487 narrative with JOC, QYC, KT timeline in PDF and Word
</commit_message>
<xml_diff>
--- a/N26487 - Scan RDI Instrument E001230 Software Crash.docx
+++ b/N26487 - Scan RDI Instrument E001230 Software Crash.docx
@@ -705,7 +705,7 @@
               <w:rPr>
                 <w:sz w:val="17"/>
               </w:rPr>
-              <w:t>On 17-Sep-2026, during routine Scan RDI sterility testing operations, an unexpected software crash occurred on the Scan RDI instrument (Equipment ID: E001230) while running session '17 Sep 2026 - 3'. Third-shift analyst JOC immediately notified Project Microbiologist QYC regarding the incident and software failure.</w:t>
+              <w:t>On 17-Sep-2026, during routine Scan RDI sterility testing operations, an unexpected software crash occurred on the Scan RDI instrument (Equipment ID: E001230) while running session '17 Sep 2026 - 3'. Third-shift analyst JOC immediately notified Project Microbiologist QYC regarding the incident and software failure. JOC attempted to re-open the application and recover the testing session data; however, the instrument repeatedly displayed error messages stating, 'Unable to Create New Session Unknown Error' and 'Unable to Load Session Unknown Error', preventing access to the session.</w:t>
             </w:r>
           </w:p>
           <w:p>
@@ -716,7 +716,7 @@
               <w:rPr>
                 <w:sz w:val="17"/>
               </w:rPr>
-              <w:t>The following day, on 18-Sep-2026, QYC attempted to re-open the application and recover the testing session data; however, the instrument repeatedly displayed error messages stating 'Unable to Create New Session Unknown Error' and 'Unable to Load Session Unknown Error', preventing access to the session.</w:t>
+              <w:t>The following day, on 18-Sep-2026, QYC attempted to re-open the application and recover the testing session data again; the session '17 Sep 2026 - 3' could be opened, but no data was present within it. Work Order WO-260470 was promptly issued to Engineering/IT by RS to formally investigate the software failure and initiate technical remediation.</w:t>
             </w:r>
           </w:p>
           <w:p>
@@ -727,7 +727,7 @@
               <w:rPr>
                 <w:sz w:val="17"/>
               </w:rPr>
-              <w:t>On 21-Sep-2026, QYC informed Eagle IT Coordinator KT (Kevin Torres) and together they attempted to restore and retrieve the session data. Following technical review, KT confirmed that the session file was corrupted, exporting as only 7 KB, and the corresponding raw acquisition dataset within the D:\ directory was completely empty and unrecoverable.</w:t>
+              <w:t>On 21-Sep-2026, QYC proactively reached out to Eagle IT Coordinator KT (who was previously unaware of the incident) and attempted to restore and retrieve the session data. Following technical review, KT confirmed that the session file was corrupted, exporting as only 7 KB, and the corresponding raw acquisition dataset within the D:\ directory was completely empty and unrecoverable.</w:t>
             </w:r>
           </w:p>
           <w:p>
@@ -738,24 +738,7 @@
               <w:rPr>
                 <w:sz w:val="17"/>
               </w:rPr>
-              <w:t>A total of three (3) sterility test sample submissions were actively processed in this corrupted session and impacted by data loss:</w:t>
-              <w:br/>
-              <w:t>• ETX-260915-0653 | Client: ANG Labs (E73555) | Sample: Semaglutide/Cyanocobalamin | Lot#: 0216202602</w:t>
-              <w:br/>
-              <w:t>• ETX-260916-0044 | Client: Southend Pharmacy (E19207) | Sample: Tirzepatide 22mg/mL-Pyridoxine HCl 4mg/mL (1 mL) | Lot#: 22666</w:t>
-              <w:br/>
-              <w:t>• ETX-260916-0374 | Client: Optimal Balance Pharmacy (E19193) | Sample: SEMAGLUTIDE/ B12 1.2 MG/ 500 MCG/ML (2 ML) Inj | Lot#: LG342010613</w:t>
-            </w:r>
-          </w:p>
-          <w:p>
-            <w:pPr>
-              <w:spacing w:before="40" w:after="60"/>
-            </w:pPr>
-            <w:r>
-              <w:rPr>
-                <w:sz w:val="17"/>
-              </w:rPr>
-              <w:t>No valid test results could be generated or verified for these submissions from the corrupted run. Work Order WO-260470 was promptly issued to Engineering/IT to formally investigate the software failure and initiate technical remediation.</w:t>
+              <w:t>Three ScanRDI test sample submissions, ETX-260915-0653, ETX-260916-0044 and ETX-260916-0374 were actively processed in this corrupted session and impacted by data loss. No valid test results could be generated or verified for these submissions from the corrupted run.</w:t>
             </w:r>
           </w:p>
         </w:tc>

</xml_diff>

<commit_message>
fix(ncr): add N/A QYC 22Sep26 to Other field and remove bullets in interim corrective actions
</commit_message>
<xml_diff>
--- a/N26487 - Scan RDI Instrument E001230 Software Crash.docx
+++ b/N26487 - Scan RDI Instrument E001230 Software Crash.docx
@@ -822,7 +822,7 @@
               <w:rPr>
                 <w:sz w:val="17"/>
               </w:rPr>
-              <w:t>Category:  [X] Equipment/System    [ ] Process/Method    [ ] Personnel    [ ] External Phenomena    [ ] Other</w:t>
+              <w:t>Category:  [X] Equipment/System    [ ] Process/Method    [ ] Personnel    [ ] External Phenomena    [ ] Other: N/A QYC 22Sep26</w:t>
             </w:r>
           </w:p>
         </w:tc>
@@ -874,11 +874,7 @@
               <w:rPr>
                 <w:sz w:val="17"/>
               </w:rPr>
-              <w:t>1. Work Order WO-260470 was issued to Engineering and IT to investigate and resolve the software crash, clear corrupted temporary files, and evaluate database integrity on instrument E001230.</w:t>
-              <w:br/>
-              <w:t>2. Instrument E001230 was taken out of service for live sample testing pending completion and sign-off of WO-260470.</w:t>
-              <w:br/>
-              <w:t>3. Client Care was instructed to request additional sample vials for retesting from ANG Labs (ETX-260915-0653) and Southend Pharmacy (ETX-260916-0044). Additional sample for ETX-260916-0374 (Optimal Balance Pharmacy) was received and is in-process with the third shift for retesting on an alternate qualified Scan RDI unit.</w:t>
+              <w:t>Work Order WO-260470 was issued to Engineering and IT to investigate and resolve the software crash, clear corrupted temporary files, and evaluate database integrity on instrument E001230. Client Care was instructed to request additional sample vials for retesting for ETX-260915-0653, ETX-260916-0044 and ETX-260916-0374.</w:t>
             </w:r>
           </w:p>
         </w:tc>

</xml_diff>